<commit_message>
Hyperlink the timesheet URL in invoice notes
</commit_message>
<xml_diff>
--- a/backend/template/invoice_template.docx
+++ b/backend/template/invoice_template.docx
@@ -5,6 +5,7 @@
     <w:p>
       <w:pPr>
         <w:rPr>
+          <w:rFonts w:ascii="Times New Roman" w:hAnsi="Times New Roman" w:cs="Times New Roman"/>
           <w:sz w:val="2"/>
           <w:szCs w:val="2"/>
         </w:rPr>
@@ -52,6 +53,7 @@
               </w:pBdr>
               <w:spacing w:line="240" w:lineRule="auto"/>
               <w:rPr>
+                <w:rFonts w:ascii="Times New Roman" w:hAnsi="Times New Roman" w:cs="Times New Roman"/>
                 <w:sz w:val="16"/>
                 <w:szCs w:val="16"/>
               </w:rPr>
@@ -82,6 +84,7 @@
               <w:spacing w:line="240" w:lineRule="auto"/>
               <w:ind w:hanging="90"/>
               <w:rPr>
+                <w:rFonts w:ascii="Times New Roman" w:hAnsi="Times New Roman" w:cs="Times New Roman"/>
                 <w:b/>
                 <w:bCs/>
                 <w:color w:val="FFFFFF"/>
@@ -114,6 +117,7 @@
               </w:pBdr>
               <w:spacing w:line="240" w:lineRule="auto"/>
               <w:rPr>
+                <w:rFonts w:ascii="Times New Roman" w:hAnsi="Times New Roman" w:cs="Times New Roman"/>
                 <w:sz w:val="16"/>
                 <w:szCs w:val="16"/>
               </w:rPr>
@@ -138,6 +142,7 @@
               <w:ind w:right="45"/>
               <w:jc w:val="right"/>
               <w:rPr>
+                <w:rFonts w:ascii="Times New Roman" w:hAnsi="Times New Roman" w:cs="Times New Roman"/>
                 <w:b/>
                 <w:bCs/>
                 <w:color w:val="FFFFFF"/>
@@ -171,6 +176,7 @@
               <w:spacing w:line="240" w:lineRule="auto"/>
               <w:ind w:left="-360" w:right="-90" w:hanging="180"/>
               <w:rPr>
+                <w:rFonts w:ascii="Times New Roman" w:hAnsi="Times New Roman" w:cs="Times New Roman"/>
                 <w:sz w:val="16"/>
                 <w:szCs w:val="16"/>
               </w:rPr>
@@ -204,6 +210,9 @@
                 <w:between w:val="nil"/>
               </w:pBdr>
               <w:spacing w:line="240" w:lineRule="auto"/>
+              <w:rPr>
+                <w:rFonts w:ascii="Times New Roman" w:hAnsi="Times New Roman" w:cs="Times New Roman"/>
+              </w:rPr>
             </w:pPr>
           </w:p>
         </w:tc>
@@ -231,6 +240,7 @@
               <w:spacing w:line="240" w:lineRule="auto"/>
               <w:ind w:hanging="90"/>
               <w:rPr>
+                <w:rFonts w:ascii="Times New Roman" w:hAnsi="Times New Roman" w:cs="Times New Roman"/>
                 <w:b/>
                 <w:bCs/>
                 <w:color w:val="FFFFFF"/>
@@ -240,6 +250,7 @@
             </w:pPr>
             <w:r>
               <w:rPr>
+                <w:rFonts w:ascii="Times New Roman" w:hAnsi="Times New Roman" w:cs="Times New Roman"/>
                 <w:b/>
                 <w:bCs/>
                 <w:noProof/>
@@ -297,6 +308,7 @@
               <w:spacing w:line="240" w:lineRule="auto"/>
               <w:ind w:hanging="90"/>
               <w:rPr>
+                <w:rFonts w:ascii="Times New Roman" w:hAnsi="Times New Roman" w:cs="Times New Roman"/>
                 <w:b/>
                 <w:bCs/>
                 <w:color w:val="FFFFFF"/>
@@ -306,6 +318,7 @@
             </w:pPr>
             <w:r>
               <w:rPr>
+                <w:rFonts w:ascii="Times New Roman" w:hAnsi="Times New Roman" w:cs="Times New Roman"/>
                 <w:b/>
                 <w:bCs/>
                 <w:color w:val="FFFFFF"/>
@@ -338,6 +351,9 @@
                 <w:between w:val="nil"/>
               </w:pBdr>
               <w:spacing w:line="240" w:lineRule="auto"/>
+              <w:rPr>
+                <w:rFonts w:ascii="Times New Roman" w:hAnsi="Times New Roman" w:cs="Times New Roman"/>
+              </w:rPr>
             </w:pPr>
           </w:p>
         </w:tc>
@@ -359,6 +375,7 @@
               <w:ind w:right="45"/>
               <w:jc w:val="right"/>
               <w:rPr>
+                <w:rFonts w:ascii="Times New Roman" w:hAnsi="Times New Roman" w:cs="Times New Roman"/>
                 <w:b/>
                 <w:bCs/>
                 <w:color w:val="FFFFFF"/>
@@ -366,7 +383,7 @@
             </w:pPr>
             <w:r>
               <w:rPr>
-                <w:rFonts w:ascii="Roboto Mono" w:eastAsia="Roboto Mono" w:hAnsi="Roboto Mono" w:cs="Roboto Mono"/>
+                <w:rFonts w:ascii="Times New Roman" w:eastAsia="Roboto Mono" w:hAnsi="Times New Roman" w:cs="Times New Roman"/>
                 <w:b/>
                 <w:bCs/>
                 <w:color w:val="FFFFFF"/>
@@ -381,6 +398,7 @@
               <w:ind w:right="45"/>
               <w:jc w:val="right"/>
               <w:rPr>
+                <w:rFonts w:ascii="Times New Roman" w:hAnsi="Times New Roman" w:cs="Times New Roman"/>
                 <w:b/>
                 <w:bCs/>
                 <w:color w:val="FFFFFF"/>
@@ -390,6 +408,7 @@
             </w:pPr>
             <w:r>
               <w:rPr>
+                <w:rFonts w:ascii="Times New Roman" w:hAnsi="Times New Roman" w:cs="Times New Roman"/>
                 <w:b/>
                 <w:bCs/>
                 <w:color w:val="FFFFFF"/>
@@ -406,6 +425,7 @@
               <w:ind w:right="45"/>
               <w:jc w:val="right"/>
               <w:rPr>
+                <w:rFonts w:ascii="Times New Roman" w:hAnsi="Times New Roman" w:cs="Times New Roman"/>
                 <w:color w:val="FFFFFF"/>
               </w:rPr>
             </w:pPr>
@@ -434,6 +454,9 @@
               </w:pBdr>
               <w:spacing w:line="240" w:lineRule="auto"/>
               <w:ind w:left="-360" w:right="-90" w:hanging="180"/>
+              <w:rPr>
+                <w:rFonts w:ascii="Times New Roman" w:hAnsi="Times New Roman" w:cs="Times New Roman"/>
+              </w:rPr>
             </w:pPr>
           </w:p>
         </w:tc>
@@ -465,6 +488,9 @@
               </w:pBdr>
               <w:spacing w:line="240" w:lineRule="auto"/>
               <w:ind w:right="45" w:hanging="90"/>
+              <w:rPr>
+                <w:rFonts w:ascii="Times New Roman" w:hAnsi="Times New Roman" w:cs="Times New Roman"/>
+              </w:rPr>
             </w:pPr>
           </w:p>
         </w:tc>
@@ -491,6 +517,9 @@
                 <w:between w:val="nil"/>
               </w:pBdr>
               <w:spacing w:line="240" w:lineRule="auto"/>
+              <w:rPr>
+                <w:rFonts w:ascii="Times New Roman" w:hAnsi="Times New Roman" w:cs="Times New Roman"/>
+              </w:rPr>
             </w:pPr>
           </w:p>
         </w:tc>
@@ -510,6 +539,7 @@
               <w:spacing w:line="392" w:lineRule="auto"/>
               <w:ind w:hanging="90"/>
               <w:rPr>
+                <w:rFonts w:ascii="Times New Roman" w:hAnsi="Times New Roman" w:cs="Times New Roman"/>
                 <w:b/>
                 <w:bCs/>
                 <w:sz w:val="16"/>
@@ -518,6 +548,7 @@
             </w:pPr>
             <w:r>
               <w:rPr>
+                <w:rFonts w:ascii="Times New Roman" w:hAnsi="Times New Roman" w:cs="Times New Roman"/>
                 <w:b/>
                 <w:bCs/>
                 <w:sz w:val="16"/>
@@ -532,13 +563,14 @@
               <w:spacing w:line="392" w:lineRule="auto"/>
               <w:ind w:hanging="90"/>
               <w:rPr>
+                <w:rFonts w:ascii="Times New Roman" w:hAnsi="Times New Roman" w:cs="Times New Roman"/>
                 <w:b/>
                 <w:bCs/>
               </w:rPr>
             </w:pPr>
             <w:r>
               <w:rPr>
-                <w:rFonts w:ascii="Roboto Mono" w:eastAsia="Roboto Mono" w:hAnsi="Roboto Mono" w:cs="Roboto Mono"/>
+                <w:rFonts w:ascii="Times New Roman" w:eastAsia="Roboto Mono" w:hAnsi="Times New Roman" w:cs="Times New Roman"/>
                 <w:b/>
                 <w:bCs/>
               </w:rPr>
@@ -551,18 +583,20 @@
               <w:spacing w:line="392" w:lineRule="auto"/>
               <w:ind w:hanging="90"/>
               <w:rPr>
+                <w:rFonts w:ascii="Times New Roman" w:hAnsi="Times New Roman" w:cs="Times New Roman"/>
                 <w:highlight w:val="white"/>
               </w:rPr>
             </w:pPr>
             <w:r>
               <w:rPr>
-                <w:rFonts w:ascii="Roboto Mono" w:eastAsia="Roboto Mono" w:hAnsi="Roboto Mono" w:cs="Roboto Mono"/>
+                <w:rFonts w:ascii="Times New Roman" w:eastAsia="Roboto Mono" w:hAnsi="Times New Roman" w:cs="Times New Roman"/>
                 <w:highlight w:val="white"/>
               </w:rPr>
               <w:t>{{ client_address_line1 }}</w:t>
             </w:r>
             <w:r>
               <w:rPr>
+                <w:rFonts w:ascii="Times New Roman" w:hAnsi="Times New Roman" w:cs="Times New Roman"/>
                 <w:highlight w:val="white"/>
               </w:rPr>
               <w:t xml:space="preserve"> </w:t>
@@ -574,18 +608,20 @@
               <w:spacing w:line="392" w:lineRule="auto"/>
               <w:ind w:hanging="90"/>
               <w:rPr>
+                <w:rFonts w:ascii="Times New Roman" w:hAnsi="Times New Roman" w:cs="Times New Roman"/>
                 <w:highlight w:val="white"/>
               </w:rPr>
             </w:pPr>
             <w:r>
               <w:rPr>
-                <w:rFonts w:ascii="Roboto Mono" w:eastAsia="Roboto Mono" w:hAnsi="Roboto Mono" w:cs="Roboto Mono"/>
+                <w:rFonts w:ascii="Times New Roman" w:eastAsia="Roboto Mono" w:hAnsi="Times New Roman" w:cs="Times New Roman"/>
                 <w:highlight w:val="white"/>
               </w:rPr>
               <w:t>{{ client_address_line2 }}</w:t>
             </w:r>
             <w:r>
               <w:rPr>
+                <w:rFonts w:ascii="Times New Roman" w:hAnsi="Times New Roman" w:cs="Times New Roman"/>
                 <w:highlight w:val="white"/>
               </w:rPr>
               <w:t xml:space="preserve"> </w:t>
@@ -597,12 +633,13 @@
               <w:spacing w:line="392" w:lineRule="auto"/>
               <w:ind w:hanging="90"/>
               <w:rPr>
+                <w:rFonts w:ascii="Times New Roman" w:hAnsi="Times New Roman" w:cs="Times New Roman"/>
                 <w:highlight w:val="white"/>
               </w:rPr>
             </w:pPr>
             <w:r>
               <w:rPr>
-                <w:rFonts w:ascii="Roboto Mono" w:eastAsia="Roboto Mono" w:hAnsi="Roboto Mono" w:cs="Roboto Mono"/>
+                <w:rFonts w:ascii="Times New Roman" w:eastAsia="Roboto Mono" w:hAnsi="Times New Roman" w:cs="Times New Roman"/>
                 <w:highlight w:val="white"/>
               </w:rPr>
               <w:t>{{ client_address_line3 }}</w:t>
@@ -614,11 +651,13 @@
               <w:spacing w:line="392" w:lineRule="auto"/>
               <w:ind w:hanging="90"/>
               <w:rPr>
+                <w:rFonts w:ascii="Times New Roman" w:hAnsi="Times New Roman" w:cs="Times New Roman"/>
                 <w:highlight w:val="white"/>
               </w:rPr>
             </w:pPr>
             <w:r>
               <w:rPr>
+                <w:rFonts w:ascii="Times New Roman" w:hAnsi="Times New Roman" w:cs="Times New Roman"/>
                 <w:highlight w:val="white"/>
               </w:rPr>
               <w:t>{{ client_email }}</w:t>
@@ -646,6 +685,9 @@
                 <w:between w:val="nil"/>
               </w:pBdr>
               <w:spacing w:line="240" w:lineRule="auto"/>
+              <w:rPr>
+                <w:rFonts w:ascii="Times New Roman" w:hAnsi="Times New Roman" w:cs="Times New Roman"/>
+              </w:rPr>
             </w:pPr>
           </w:p>
         </w:tc>
@@ -666,6 +708,7 @@
               <w:ind w:right="45"/>
               <w:jc w:val="right"/>
               <w:rPr>
+                <w:rFonts w:ascii="Times New Roman" w:hAnsi="Times New Roman" w:cs="Times New Roman"/>
                 <w:b/>
                 <w:bCs/>
                 <w:sz w:val="16"/>
@@ -674,6 +717,7 @@
             </w:pPr>
             <w:r>
               <w:rPr>
+                <w:rFonts w:ascii="Times New Roman" w:hAnsi="Times New Roman" w:cs="Times New Roman"/>
                 <w:b/>
                 <w:bCs/>
                 <w:sz w:val="16"/>
@@ -689,12 +733,14 @@
               <w:ind w:right="45"/>
               <w:jc w:val="right"/>
               <w:rPr>
+                <w:rFonts w:ascii="Times New Roman" w:hAnsi="Times New Roman" w:cs="Times New Roman"/>
                 <w:sz w:val="18"/>
                 <w:szCs w:val="18"/>
               </w:rPr>
             </w:pPr>
             <w:r>
               <w:rPr>
+                <w:rFonts w:ascii="Times New Roman" w:hAnsi="Times New Roman" w:cs="Times New Roman"/>
                 <w:sz w:val="18"/>
                 <w:szCs w:val="18"/>
               </w:rPr>
@@ -708,6 +754,7 @@
               <w:ind w:right="45"/>
               <w:jc w:val="right"/>
               <w:rPr>
+                <w:rFonts w:ascii="Times New Roman" w:hAnsi="Times New Roman" w:cs="Times New Roman"/>
                 <w:b/>
                 <w:bCs/>
                 <w:sz w:val="16"/>
@@ -716,6 +763,7 @@
             </w:pPr>
             <w:r>
               <w:rPr>
+                <w:rFonts w:ascii="Times New Roman" w:hAnsi="Times New Roman" w:cs="Times New Roman"/>
                 <w:b/>
                 <w:bCs/>
                 <w:sz w:val="16"/>
@@ -731,13 +779,14 @@
               <w:ind w:right="45"/>
               <w:jc w:val="right"/>
               <w:rPr>
+                <w:rFonts w:ascii="Times New Roman" w:hAnsi="Times New Roman" w:cs="Times New Roman"/>
                 <w:sz w:val="18"/>
                 <w:szCs w:val="18"/>
               </w:rPr>
             </w:pPr>
             <w:r>
               <w:rPr>
-                <w:rFonts w:ascii="Roboto Mono" w:eastAsia="Roboto Mono" w:hAnsi="Roboto Mono" w:cs="Roboto Mono"/>
+                <w:rFonts w:ascii="Times New Roman" w:eastAsia="Roboto Mono" w:hAnsi="Times New Roman" w:cs="Times New Roman"/>
                 <w:sz w:val="18"/>
                 <w:szCs w:val="18"/>
               </w:rPr>
@@ -749,6 +798,9 @@
               <w:widowControl w:val="0"/>
               <w:spacing w:line="392" w:lineRule="auto"/>
               <w:ind w:right="45"/>
+              <w:rPr>
+                <w:rFonts w:ascii="Times New Roman" w:hAnsi="Times New Roman" w:cs="Times New Roman"/>
+              </w:rPr>
             </w:pPr>
           </w:p>
         </w:tc>
@@ -773,6 +825,9 @@
                 <w:between w:val="nil"/>
               </w:pBdr>
               <w:spacing w:line="240" w:lineRule="auto"/>
+              <w:rPr>
+                <w:rFonts w:ascii="Times New Roman" w:hAnsi="Times New Roman" w:cs="Times New Roman"/>
+              </w:rPr>
             </w:pPr>
           </w:p>
         </w:tc>
@@ -804,12 +859,16 @@
               </w:pBdr>
               <w:spacing w:line="240" w:lineRule="auto"/>
               <w:jc w:val="center"/>
+              <w:rPr>
+                <w:rFonts w:ascii="Times New Roman" w:hAnsi="Times New Roman" w:cs="Times New Roman"/>
+              </w:rPr>
             </w:pPr>
             <w:r>
               <w:rPr>
+                <w:rFonts w:ascii="Times New Roman" w:hAnsi="Times New Roman" w:cs="Times New Roman"/>
                 <w:noProof/>
               </w:rPr>
-              <w:pict w14:anchorId="6A59466A">
+              <w:pict w14:anchorId="7CE811CE">
                 <v:rect id="_x0000_i1025" alt="" style="width:451.3pt;height:.05pt;mso-width-percent:0;mso-height-percent:0;mso-width-percent:0;mso-height-percent:0" o:hralign="center" o:hrstd="t" o:hr="t" fillcolor="#a0a0a0" stroked="f"/>
               </w:pict>
             </w:r>
@@ -817,7 +876,13 @@
         </w:tc>
       </w:tr>
     </w:tbl>
-    <w:p/>
+    <w:p>
+      <w:pPr>
+        <w:rPr>
+          <w:rFonts w:ascii="Times New Roman" w:hAnsi="Times New Roman" w:cs="Times New Roman"/>
+        </w:rPr>
+      </w:pPr>
+    </w:p>
     <w:tbl>
       <w:tblPr>
         <w:tblStyle w:val="a0"/>
@@ -833,8 +898,9 @@
         <w:gridCol w:w="1935"/>
         <w:gridCol w:w="1650"/>
         <w:gridCol w:w="555"/>
-        <w:gridCol w:w="1590"/>
-        <w:gridCol w:w="450"/>
+        <w:gridCol w:w="1581"/>
+        <w:gridCol w:w="141"/>
+        <w:gridCol w:w="318"/>
       </w:tblGrid>
       <w:tr>
         <w:trPr>
@@ -861,6 +927,9 @@
                 <w:between w:val="nil"/>
               </w:pBdr>
               <w:spacing w:line="240" w:lineRule="auto"/>
+              <w:rPr>
+                <w:rFonts w:ascii="Times New Roman" w:hAnsi="Times New Roman" w:cs="Times New Roman"/>
+              </w:rPr>
             </w:pPr>
           </w:p>
         </w:tc>
@@ -886,6 +955,7 @@
               </w:pBdr>
               <w:spacing w:line="240" w:lineRule="auto"/>
               <w:rPr>
+                <w:rFonts w:ascii="Times New Roman" w:hAnsi="Times New Roman" w:cs="Times New Roman"/>
                 <w:b/>
                 <w:bCs/>
                 <w:sz w:val="16"/>
@@ -894,6 +964,7 @@
             </w:pPr>
             <w:r>
               <w:rPr>
+                <w:rFonts w:ascii="Times New Roman" w:hAnsi="Times New Roman" w:cs="Times New Roman"/>
                 <w:b/>
                 <w:bCs/>
                 <w:sz w:val="16"/>
@@ -914,6 +985,7 @@
               </w:pBdr>
               <w:spacing w:line="240" w:lineRule="auto"/>
               <w:rPr>
+                <w:rFonts w:ascii="Times New Roman" w:hAnsi="Times New Roman" w:cs="Times New Roman"/>
                 <w:b/>
                 <w:bCs/>
                 <w:sz w:val="16"/>
@@ -933,74 +1005,88 @@
               </w:pBdr>
               <w:spacing w:line="240" w:lineRule="auto"/>
               <w:rPr>
+                <w:rFonts w:ascii="Times New Roman" w:hAnsi="Times New Roman" w:cs="Times New Roman"/>
                 <w:b/>
                 <w:bCs/>
                 <w:sz w:val="16"/>
                 <w:szCs w:val="16"/>
               </w:rPr>
             </w:pPr>
-            <w:r>
-              <w:rPr>
-                <w:rFonts w:ascii="Roboto Mono" w:eastAsia="Roboto Mono" w:hAnsi="Roboto Mono" w:cs="Roboto Mono"/>
+          </w:p>
+        </w:tc>
+        <w:tc>
+          <w:tcPr>
+            <w:tcW w:w="4065" w:type="dxa"/>
+            <w:tcMar>
+              <w:top w:w="100" w:type="dxa"/>
+              <w:left w:w="100" w:type="dxa"/>
+              <w:bottom w:w="100" w:type="dxa"/>
+              <w:right w:w="100" w:type="dxa"/>
+            </w:tcMar>
+          </w:tcPr>
+          <w:p>
+            <w:pPr>
+              <w:widowControl w:val="0"/>
+              <w:pBdr>
+                <w:top w:val="nil"/>
+                <w:left w:val="nil"/>
+                <w:bottom w:val="nil"/>
+                <w:right w:val="nil"/>
+                <w:between w:val="nil"/>
+              </w:pBdr>
+              <w:spacing w:line="240" w:lineRule="auto"/>
+              <w:rPr>
+                <w:rFonts w:ascii="Times New Roman" w:hAnsi="Times New Roman" w:cs="Times New Roman"/>
                 <w:b/>
                 <w:bCs/>
                 <w:sz w:val="16"/>
                 <w:szCs w:val="16"/>
               </w:rPr>
-              <w:t>{%tr for item in items %}{{ loop.index }}</w:t>
-            </w:r>
-          </w:p>
-        </w:tc>
-        <w:tc>
-          <w:tcPr>
-            <w:tcW w:w="4065" w:type="dxa"/>
-            <w:tcMar>
-              <w:top w:w="100" w:type="dxa"/>
-              <w:left w:w="100" w:type="dxa"/>
-              <w:bottom w:w="100" w:type="dxa"/>
-              <w:right w:w="100" w:type="dxa"/>
-            </w:tcMar>
-          </w:tcPr>
-          <w:p>
-            <w:pPr>
-              <w:widowControl w:val="0"/>
-              <w:pBdr>
-                <w:top w:val="nil"/>
-                <w:left w:val="nil"/>
-                <w:bottom w:val="nil"/>
-                <w:right w:val="nil"/>
-                <w:between w:val="nil"/>
-              </w:pBdr>
-              <w:spacing w:line="240" w:lineRule="auto"/>
-              <w:rPr>
+            </w:pPr>
+            <w:r>
+              <w:rPr>
+                <w:rFonts w:ascii="Times New Roman" w:hAnsi="Times New Roman" w:cs="Times New Roman"/>
                 <w:b/>
                 <w:bCs/>
                 <w:sz w:val="16"/>
                 <w:szCs w:val="16"/>
               </w:rPr>
-            </w:pPr>
-            <w:r>
-              <w:rPr>
+              <w:t>DESCRIPTION</w:t>
+            </w:r>
+          </w:p>
+          <w:p>
+            <w:pPr>
+              <w:widowControl w:val="0"/>
+              <w:pBdr>
+                <w:top w:val="nil"/>
+                <w:left w:val="nil"/>
+                <w:bottom w:val="nil"/>
+                <w:right w:val="nil"/>
+                <w:between w:val="nil"/>
+              </w:pBdr>
+              <w:spacing w:line="240" w:lineRule="auto"/>
+              <w:rPr>
+                <w:rFonts w:ascii="Times New Roman" w:hAnsi="Times New Roman" w:cs="Times New Roman"/>
                 <w:b/>
                 <w:bCs/>
                 <w:sz w:val="16"/>
                 <w:szCs w:val="16"/>
               </w:rPr>
-              <w:t>DESCRIPTION</w:t>
-            </w:r>
-          </w:p>
-          <w:p>
-            <w:pPr>
-              <w:widowControl w:val="0"/>
-              <w:pBdr>
-                <w:top w:val="nil"/>
-                <w:left w:val="nil"/>
-                <w:bottom w:val="nil"/>
-                <w:right w:val="nil"/>
-                <w:between w:val="nil"/>
-              </w:pBdr>
-              <w:spacing w:line="240" w:lineRule="auto"/>
-              <w:rPr>
+            </w:pPr>
+          </w:p>
+          <w:p>
+            <w:pPr>
+              <w:widowControl w:val="0"/>
+              <w:pBdr>
+                <w:top w:val="nil"/>
+                <w:left w:val="nil"/>
+                <w:bottom w:val="nil"/>
+                <w:right w:val="nil"/>
+                <w:between w:val="nil"/>
+              </w:pBdr>
+              <w:spacing w:line="240" w:lineRule="auto"/>
+              <w:rPr>
+                <w:rFonts w:ascii="Times New Roman" w:hAnsi="Times New Roman" w:cs="Times New Roman"/>
                 <w:b/>
                 <w:bCs/>
                 <w:sz w:val="16"/>
@@ -1008,188 +1094,185 @@
               </w:rPr>
             </w:pPr>
           </w:p>
-          <w:p>
-            <w:pPr>
-              <w:widowControl w:val="0"/>
-              <w:pBdr>
-                <w:top w:val="nil"/>
-                <w:left w:val="nil"/>
-                <w:bottom w:val="nil"/>
-                <w:right w:val="nil"/>
-                <w:between w:val="nil"/>
-              </w:pBdr>
-              <w:spacing w:line="240" w:lineRule="auto"/>
-              <w:rPr>
+        </w:tc>
+        <w:tc>
+          <w:tcPr>
+            <w:tcW w:w="1935" w:type="dxa"/>
+            <w:tcMar>
+              <w:top w:w="100" w:type="dxa"/>
+              <w:left w:w="100" w:type="dxa"/>
+              <w:bottom w:w="100" w:type="dxa"/>
+              <w:right w:w="100" w:type="dxa"/>
+            </w:tcMar>
+          </w:tcPr>
+          <w:p>
+            <w:pPr>
+              <w:widowControl w:val="0"/>
+              <w:pBdr>
+                <w:top w:val="nil"/>
+                <w:left w:val="nil"/>
+                <w:bottom w:val="nil"/>
+                <w:right w:val="nil"/>
+                <w:between w:val="nil"/>
+              </w:pBdr>
+              <w:spacing w:line="240" w:lineRule="auto"/>
+              <w:jc w:val="right"/>
+              <w:rPr>
+                <w:rFonts w:ascii="Times New Roman" w:hAnsi="Times New Roman" w:cs="Times New Roman"/>
                 <w:b/>
                 <w:bCs/>
                 <w:sz w:val="16"/>
                 <w:szCs w:val="16"/>
               </w:rPr>
             </w:pPr>
-          </w:p>
-        </w:tc>
-        <w:tc>
-          <w:tcPr>
-            <w:tcW w:w="1935" w:type="dxa"/>
-            <w:tcMar>
-              <w:top w:w="100" w:type="dxa"/>
-              <w:left w:w="100" w:type="dxa"/>
-              <w:bottom w:w="100" w:type="dxa"/>
-              <w:right w:w="100" w:type="dxa"/>
-            </w:tcMar>
-          </w:tcPr>
-          <w:p>
-            <w:pPr>
-              <w:widowControl w:val="0"/>
-              <w:pBdr>
-                <w:top w:val="nil"/>
-                <w:left w:val="nil"/>
-                <w:bottom w:val="nil"/>
-                <w:right w:val="nil"/>
-                <w:between w:val="nil"/>
-              </w:pBdr>
-              <w:spacing w:line="240" w:lineRule="auto"/>
-              <w:jc w:val="right"/>
-              <w:rPr>
+            <w:r>
+              <w:rPr>
+                <w:rFonts w:ascii="Times New Roman" w:hAnsi="Times New Roman" w:cs="Times New Roman"/>
                 <w:b/>
                 <w:bCs/>
                 <w:sz w:val="16"/>
                 <w:szCs w:val="16"/>
               </w:rPr>
+              <w:t>QUANTITY</w:t>
+            </w:r>
+          </w:p>
+        </w:tc>
+        <w:tc>
+          <w:tcPr>
+            <w:tcW w:w="1650" w:type="dxa"/>
+            <w:tcMar>
+              <w:top w:w="100" w:type="dxa"/>
+              <w:left w:w="100" w:type="dxa"/>
+              <w:bottom w:w="100" w:type="dxa"/>
+              <w:right w:w="100" w:type="dxa"/>
+            </w:tcMar>
+          </w:tcPr>
+          <w:p>
+            <w:pPr>
+              <w:widowControl w:val="0"/>
+              <w:pBdr>
+                <w:top w:val="nil"/>
+                <w:left w:val="nil"/>
+                <w:bottom w:val="nil"/>
+                <w:right w:val="nil"/>
+                <w:between w:val="nil"/>
+              </w:pBdr>
+              <w:spacing w:line="240" w:lineRule="auto"/>
+              <w:jc w:val="right"/>
+              <w:rPr>
+                <w:rFonts w:ascii="Times New Roman" w:hAnsi="Times New Roman" w:cs="Times New Roman"/>
+              </w:rPr>
             </w:pPr>
             <w:r>
               <w:rPr>
+                <w:rFonts w:ascii="Times New Roman" w:hAnsi="Times New Roman" w:cs="Times New Roman"/>
                 <w:b/>
                 <w:bCs/>
                 <w:sz w:val="16"/>
                 <w:szCs w:val="16"/>
               </w:rPr>
-              <w:t>QUANTITY</w:t>
+              <w:t>PRICE</w:t>
             </w:r>
           </w:p>
         </w:tc>
         <w:tc>
           <w:tcPr>
-            <w:tcW w:w="1650" w:type="dxa"/>
-            <w:tcMar>
-              <w:top w:w="100" w:type="dxa"/>
-              <w:left w:w="100" w:type="dxa"/>
-              <w:bottom w:w="100" w:type="dxa"/>
-              <w:right w:w="100" w:type="dxa"/>
-            </w:tcMar>
-          </w:tcPr>
-          <w:p>
-            <w:pPr>
-              <w:widowControl w:val="0"/>
-              <w:pBdr>
-                <w:top w:val="nil"/>
-                <w:left w:val="nil"/>
-                <w:bottom w:val="nil"/>
-                <w:right w:val="nil"/>
-                <w:between w:val="nil"/>
-              </w:pBdr>
-              <w:spacing w:line="240" w:lineRule="auto"/>
-              <w:jc w:val="right"/>
-            </w:pPr>
-            <w:r>
-              <w:rPr>
+            <w:tcW w:w="555" w:type="dxa"/>
+            <w:tcMar>
+              <w:top w:w="100" w:type="dxa"/>
+              <w:left w:w="100" w:type="dxa"/>
+              <w:bottom w:w="100" w:type="dxa"/>
+              <w:right w:w="100" w:type="dxa"/>
+            </w:tcMar>
+          </w:tcPr>
+          <w:p>
+            <w:pPr>
+              <w:widowControl w:val="0"/>
+              <w:spacing w:line="360" w:lineRule="auto"/>
+              <w:jc w:val="right"/>
+              <w:rPr>
+                <w:rFonts w:ascii="Times New Roman" w:hAnsi="Times New Roman" w:cs="Times New Roman"/>
                 <w:b/>
                 <w:bCs/>
                 <w:sz w:val="16"/>
                 <w:szCs w:val="16"/>
               </w:rPr>
-              <w:t>PRICE</w:t>
-            </w:r>
-          </w:p>
-        </w:tc>
-        <w:tc>
-          <w:tcPr>
-            <w:tcW w:w="555" w:type="dxa"/>
-            <w:tcMar>
-              <w:top w:w="100" w:type="dxa"/>
-              <w:left w:w="100" w:type="dxa"/>
-              <w:bottom w:w="100" w:type="dxa"/>
-              <w:right w:w="100" w:type="dxa"/>
-            </w:tcMar>
-          </w:tcPr>
-          <w:p>
-            <w:pPr>
-              <w:widowControl w:val="0"/>
-              <w:spacing w:line="360" w:lineRule="auto"/>
-              <w:jc w:val="right"/>
-              <w:rPr>
+            </w:pPr>
+            <w:r>
+              <w:rPr>
+                <w:rFonts w:ascii="Times New Roman" w:hAnsi="Times New Roman" w:cs="Times New Roman"/>
                 <w:b/>
                 <w:bCs/>
                 <w:sz w:val="16"/>
                 <w:szCs w:val="16"/>
               </w:rPr>
+              <w:t>TAX</w:t>
+            </w:r>
+          </w:p>
+        </w:tc>
+        <w:tc>
+          <w:tcPr>
+            <w:tcW w:w="1581" w:type="dxa"/>
+            <w:tcMar>
+              <w:top w:w="100" w:type="dxa"/>
+              <w:left w:w="100" w:type="dxa"/>
+              <w:bottom w:w="100" w:type="dxa"/>
+              <w:right w:w="100" w:type="dxa"/>
+            </w:tcMar>
+          </w:tcPr>
+          <w:p>
+            <w:pPr>
+              <w:widowControl w:val="0"/>
+              <w:pBdr>
+                <w:top w:val="nil"/>
+                <w:left w:val="nil"/>
+                <w:bottom w:val="nil"/>
+                <w:right w:val="nil"/>
+                <w:between w:val="nil"/>
+              </w:pBdr>
+              <w:spacing w:line="240" w:lineRule="auto"/>
+              <w:jc w:val="right"/>
+              <w:rPr>
+                <w:rFonts w:ascii="Times New Roman" w:hAnsi="Times New Roman" w:cs="Times New Roman"/>
+              </w:rPr>
             </w:pPr>
             <w:r>
               <w:rPr>
+                <w:rFonts w:ascii="Times New Roman" w:hAnsi="Times New Roman" w:cs="Times New Roman"/>
                 <w:b/>
                 <w:bCs/>
                 <w:sz w:val="16"/>
                 <w:szCs w:val="16"/>
               </w:rPr>
-              <w:t>TAX</w:t>
-            </w:r>
-          </w:p>
-        </w:tc>
-        <w:tc>
-          <w:tcPr>
-            <w:tcW w:w="1590" w:type="dxa"/>
-            <w:tcMar>
-              <w:top w:w="100" w:type="dxa"/>
-              <w:left w:w="100" w:type="dxa"/>
-              <w:bottom w:w="100" w:type="dxa"/>
-              <w:right w:w="100" w:type="dxa"/>
-            </w:tcMar>
-          </w:tcPr>
-          <w:p>
-            <w:pPr>
-              <w:widowControl w:val="0"/>
-              <w:pBdr>
-                <w:top w:val="nil"/>
-                <w:left w:val="nil"/>
-                <w:bottom w:val="nil"/>
-                <w:right w:val="nil"/>
-                <w:between w:val="nil"/>
-              </w:pBdr>
-              <w:spacing w:line="240" w:lineRule="auto"/>
-              <w:jc w:val="right"/>
-            </w:pPr>
-            <w:r>
-              <w:rPr>
-                <w:b/>
-                <w:bCs/>
-                <w:sz w:val="16"/>
-                <w:szCs w:val="16"/>
-              </w:rPr>
               <w:t>AMOUNT</w:t>
             </w:r>
           </w:p>
         </w:tc>
         <w:tc>
           <w:tcPr>
-            <w:tcW w:w="450" w:type="dxa"/>
-            <w:tcMar>
-              <w:top w:w="100" w:type="dxa"/>
-              <w:left w:w="100" w:type="dxa"/>
-              <w:bottom w:w="100" w:type="dxa"/>
-              <w:right w:w="100" w:type="dxa"/>
-            </w:tcMar>
-          </w:tcPr>
-          <w:p>
-            <w:pPr>
-              <w:widowControl w:val="0"/>
-              <w:pBdr>
-                <w:top w:val="nil"/>
-                <w:left w:val="nil"/>
-                <w:bottom w:val="nil"/>
-                <w:right w:val="nil"/>
-                <w:between w:val="nil"/>
-              </w:pBdr>
-              <w:spacing w:line="240" w:lineRule="auto"/>
+            <w:tcW w:w="459" w:type="dxa"/>
+            <w:gridSpan w:val="2"/>
+            <w:tcMar>
+              <w:top w:w="100" w:type="dxa"/>
+              <w:left w:w="100" w:type="dxa"/>
+              <w:bottom w:w="100" w:type="dxa"/>
+              <w:right w:w="100" w:type="dxa"/>
+            </w:tcMar>
+          </w:tcPr>
+          <w:p>
+            <w:pPr>
+              <w:widowControl w:val="0"/>
+              <w:pBdr>
+                <w:top w:val="nil"/>
+                <w:left w:val="nil"/>
+                <w:bottom w:val="nil"/>
+                <w:right w:val="nil"/>
+                <w:between w:val="nil"/>
+              </w:pBdr>
+              <w:spacing w:line="240" w:lineRule="auto"/>
+              <w:rPr>
+                <w:rFonts w:ascii="Times New Roman" w:hAnsi="Times New Roman" w:cs="Times New Roman"/>
+              </w:rPr>
             </w:pPr>
           </w:p>
         </w:tc>
@@ -1220,6 +1303,7 @@
               </w:pBdr>
               <w:spacing w:line="240" w:lineRule="auto"/>
               <w:rPr>
+                <w:rFonts w:ascii="Times New Roman" w:hAnsi="Times New Roman" w:cs="Times New Roman"/>
                 <w:sz w:val="18"/>
                 <w:szCs w:val="18"/>
               </w:rPr>
@@ -1248,10 +1332,41 @@
               </w:pBdr>
               <w:spacing w:line="240" w:lineRule="auto"/>
               <w:rPr>
-                <w:sz w:val="18"/>
-                <w:szCs w:val="18"/>
-              </w:rPr>
-            </w:pPr>
+                <w:rFonts w:ascii="Times New Roman" w:eastAsia="Roboto Mono" w:hAnsi="Times New Roman" w:cs="Times New Roman"/>
+                <w:b/>
+                <w:bCs/>
+                <w:sz w:val="16"/>
+                <w:szCs w:val="16"/>
+              </w:rPr>
+            </w:pPr>
+          </w:p>
+          <w:p>
+            <w:pPr>
+              <w:widowControl w:val="0"/>
+              <w:pBdr>
+                <w:top w:val="nil"/>
+                <w:left w:val="nil"/>
+                <w:bottom w:val="nil"/>
+                <w:right w:val="nil"/>
+                <w:between w:val="nil"/>
+              </w:pBdr>
+              <w:spacing w:line="240" w:lineRule="auto"/>
+              <w:rPr>
+                <w:rFonts w:ascii="Times New Roman" w:hAnsi="Times New Roman" w:cs="Times New Roman"/>
+                <w:sz w:val="18"/>
+                <w:szCs w:val="18"/>
+              </w:rPr>
+            </w:pPr>
+            <w:r>
+              <w:rPr>
+                <w:rFonts w:ascii="Times New Roman" w:eastAsia="Roboto Mono" w:hAnsi="Times New Roman" w:cs="Times New Roman"/>
+                <w:b/>
+                <w:bCs/>
+                <w:sz w:val="16"/>
+                <w:szCs w:val="16"/>
+              </w:rPr>
+              <w:t>{%tr for item in items %}</w:t>
+            </w:r>
           </w:p>
         </w:tc>
         <w:tc>
@@ -1275,14 +1390,10 @@
                 <w:between w:val="nil"/>
               </w:pBdr>
               <w:spacing w:line="240" w:lineRule="auto"/>
-            </w:pPr>
-            <w:r>
-              <w:rPr>
-                <w:color w:val="0E0E0E"/>
-                <w:highlight w:val="white"/>
-              </w:rPr>
-              <w:t>{{ item.description }}</w:t>
-            </w:r>
+              <w:rPr>
+                <w:rFonts w:ascii="Times New Roman" w:hAnsi="Times New Roman" w:cs="Times New Roman"/>
+              </w:rPr>
+            </w:pPr>
           </w:p>
         </w:tc>
         <w:tc>
@@ -1307,14 +1418,10 @@
               </w:pBdr>
               <w:spacing w:line="240" w:lineRule="auto"/>
               <w:jc w:val="right"/>
-            </w:pPr>
-            <w:r>
-              <w:rPr>
-                <w:color w:val="0E0E0E"/>
-                <w:highlight w:val="white"/>
-              </w:rPr>
-              <w:t>{{ item.quantity }}</w:t>
-            </w:r>
+              <w:rPr>
+                <w:rFonts w:ascii="Times New Roman" w:hAnsi="Times New Roman" w:cs="Times New Roman"/>
+              </w:rPr>
+            </w:pPr>
           </w:p>
         </w:tc>
         <w:tc>
@@ -1339,10 +1446,10 @@
               </w:pBdr>
               <w:spacing w:line="240" w:lineRule="auto"/>
               <w:jc w:val="right"/>
-            </w:pPr>
-            <w:r>
-              <w:t>{{ item.price }}</w:t>
-            </w:r>
+              <w:rPr>
+                <w:rFonts w:ascii="Times New Roman" w:hAnsi="Times New Roman" w:cs="Times New Roman"/>
+              </w:rPr>
+            </w:pPr>
           </w:p>
         </w:tc>
         <w:tc>
@@ -1367,59 +1474,58 @@
               </w:pBdr>
               <w:spacing w:line="240" w:lineRule="auto"/>
               <w:jc w:val="right"/>
-            </w:pPr>
-            <w:r>
-              <w:t>{{ item.tax }}</w:t>
-            </w:r>
-          </w:p>
-        </w:tc>
-        <w:tc>
-          <w:tcPr>
-            <w:tcW w:w="1590" w:type="dxa"/>
-            <w:tcMar>
-              <w:top w:w="100" w:type="dxa"/>
-              <w:left w:w="100" w:type="dxa"/>
-              <w:bottom w:w="100" w:type="dxa"/>
-              <w:right w:w="100" w:type="dxa"/>
-            </w:tcMar>
-          </w:tcPr>
-          <w:p>
-            <w:pPr>
-              <w:widowControl w:val="0"/>
-              <w:spacing w:line="240" w:lineRule="auto"/>
-              <w:jc w:val="right"/>
-            </w:pPr>
-            <w:r>
-              <w:rPr>
-                <w:rFonts w:ascii="Roboto Mono" w:eastAsia="Roboto Mono" w:hAnsi="Roboto Mono" w:cs="Roboto Mono"/>
-                <w:sz w:val="18"/>
-                <w:szCs w:val="18"/>
-              </w:rPr>
-              <w:t>{{ item.amount }}{%tr endfor %}</w:t>
-            </w:r>
-          </w:p>
-        </w:tc>
-        <w:tc>
-          <w:tcPr>
-            <w:tcW w:w="450" w:type="dxa"/>
-            <w:tcMar>
-              <w:top w:w="100" w:type="dxa"/>
-              <w:left w:w="100" w:type="dxa"/>
-              <w:bottom w:w="100" w:type="dxa"/>
-              <w:right w:w="100" w:type="dxa"/>
-            </w:tcMar>
-          </w:tcPr>
-          <w:p>
-            <w:pPr>
-              <w:widowControl w:val="0"/>
-              <w:pBdr>
-                <w:top w:val="nil"/>
-                <w:left w:val="nil"/>
-                <w:bottom w:val="nil"/>
-                <w:right w:val="nil"/>
-                <w:between w:val="nil"/>
-              </w:pBdr>
-              <w:spacing w:line="240" w:lineRule="auto"/>
+              <w:rPr>
+                <w:rFonts w:ascii="Times New Roman" w:hAnsi="Times New Roman" w:cs="Times New Roman"/>
+              </w:rPr>
+            </w:pPr>
+          </w:p>
+        </w:tc>
+        <w:tc>
+          <w:tcPr>
+            <w:tcW w:w="1722" w:type="dxa"/>
+            <w:gridSpan w:val="2"/>
+            <w:tcMar>
+              <w:top w:w="100" w:type="dxa"/>
+              <w:left w:w="100" w:type="dxa"/>
+              <w:bottom w:w="100" w:type="dxa"/>
+              <w:right w:w="100" w:type="dxa"/>
+            </w:tcMar>
+          </w:tcPr>
+          <w:p>
+            <w:pPr>
+              <w:widowControl w:val="0"/>
+              <w:spacing w:line="240" w:lineRule="auto"/>
+              <w:jc w:val="right"/>
+              <w:rPr>
+                <w:rFonts w:ascii="Times New Roman" w:hAnsi="Times New Roman" w:cs="Times New Roman"/>
+              </w:rPr>
+            </w:pPr>
+          </w:p>
+        </w:tc>
+        <w:tc>
+          <w:tcPr>
+            <w:tcW w:w="318" w:type="dxa"/>
+            <w:tcMar>
+              <w:top w:w="100" w:type="dxa"/>
+              <w:left w:w="100" w:type="dxa"/>
+              <w:bottom w:w="100" w:type="dxa"/>
+              <w:right w:w="100" w:type="dxa"/>
+            </w:tcMar>
+          </w:tcPr>
+          <w:p>
+            <w:pPr>
+              <w:widowControl w:val="0"/>
+              <w:pBdr>
+                <w:top w:val="nil"/>
+                <w:left w:val="nil"/>
+                <w:bottom w:val="nil"/>
+                <w:right w:val="nil"/>
+                <w:between w:val="nil"/>
+              </w:pBdr>
+              <w:spacing w:line="240" w:lineRule="auto"/>
+              <w:rPr>
+                <w:rFonts w:ascii="Times New Roman" w:hAnsi="Times New Roman" w:cs="Times New Roman"/>
+              </w:rPr>
             </w:pPr>
           </w:p>
         </w:tc>
@@ -1450,6 +1556,7 @@
               </w:pBdr>
               <w:spacing w:line="240" w:lineRule="auto"/>
               <w:rPr>
+                <w:rFonts w:ascii="Times New Roman" w:hAnsi="Times New Roman" w:cs="Times New Roman"/>
                 <w:sz w:val="18"/>
                 <w:szCs w:val="18"/>
               </w:rPr>
@@ -1478,10 +1585,21 @@
               </w:pBdr>
               <w:spacing w:line="240" w:lineRule="auto"/>
               <w:rPr>
-                <w:sz w:val="18"/>
-                <w:szCs w:val="18"/>
-              </w:rPr>
-            </w:pPr>
+                <w:rFonts w:ascii="Times New Roman" w:hAnsi="Times New Roman" w:cs="Times New Roman"/>
+                <w:sz w:val="18"/>
+                <w:szCs w:val="18"/>
+              </w:rPr>
+            </w:pPr>
+            <w:r>
+              <w:rPr>
+                <w:rFonts w:ascii="Times New Roman" w:eastAsia="Roboto Mono" w:hAnsi="Times New Roman" w:cs="Times New Roman"/>
+                <w:b/>
+                <w:bCs/>
+                <w:sz w:val="16"/>
+                <w:szCs w:val="16"/>
+              </w:rPr>
+              <w:t>{{loop.index }}</w:t>
+            </w:r>
           </w:p>
         </w:tc>
         <w:tc>
@@ -1498,7 +1616,18 @@
             <w:pPr>
               <w:widowControl w:val="0"/>
               <w:spacing w:line="240" w:lineRule="auto"/>
-            </w:pPr>
+              <w:rPr>
+                <w:rFonts w:ascii="Times New Roman" w:hAnsi="Times New Roman" w:cs="Times New Roman"/>
+              </w:rPr>
+            </w:pPr>
+            <w:r>
+              <w:rPr>
+                <w:rFonts w:ascii="Times New Roman" w:hAnsi="Times New Roman" w:cs="Times New Roman"/>
+                <w:color w:val="0E0E0E"/>
+                <w:highlight w:val="white"/>
+              </w:rPr>
+              <w:t>{{ item.description }}</w:t>
+            </w:r>
           </w:p>
         </w:tc>
         <w:tc>
@@ -1523,7 +1652,18 @@
               </w:pBdr>
               <w:spacing w:line="240" w:lineRule="auto"/>
               <w:jc w:val="right"/>
-            </w:pPr>
+              <w:rPr>
+                <w:rFonts w:ascii="Times New Roman" w:hAnsi="Times New Roman" w:cs="Times New Roman"/>
+              </w:rPr>
+            </w:pPr>
+            <w:r>
+              <w:rPr>
+                <w:rFonts w:ascii="Times New Roman" w:hAnsi="Times New Roman" w:cs="Times New Roman"/>
+                <w:color w:val="0E0E0E"/>
+                <w:highlight w:val="white"/>
+              </w:rPr>
+              <w:t>{{ item.quantity }}</w:t>
+            </w:r>
           </w:p>
         </w:tc>
         <w:tc>
@@ -1541,7 +1681,16 @@
               <w:widowControl w:val="0"/>
               <w:spacing w:line="240" w:lineRule="auto"/>
               <w:jc w:val="right"/>
-            </w:pPr>
+              <w:rPr>
+                <w:rFonts w:ascii="Times New Roman" w:hAnsi="Times New Roman" w:cs="Times New Roman"/>
+              </w:rPr>
+            </w:pPr>
+            <w:r>
+              <w:rPr>
+                <w:rFonts w:ascii="Times New Roman" w:hAnsi="Times New Roman" w:cs="Times New Roman"/>
+              </w:rPr>
+              <w:t>{{ item.price }}</w:t>
+            </w:r>
           </w:p>
         </w:tc>
         <w:tc>
@@ -1559,48 +1708,72 @@
               <w:widowControl w:val="0"/>
               <w:spacing w:line="240" w:lineRule="auto"/>
               <w:jc w:val="right"/>
-            </w:pPr>
-          </w:p>
-        </w:tc>
-        <w:tc>
-          <w:tcPr>
-            <w:tcW w:w="1590" w:type="dxa"/>
-            <w:tcMar>
-              <w:top w:w="100" w:type="dxa"/>
-              <w:left w:w="100" w:type="dxa"/>
-              <w:bottom w:w="100" w:type="dxa"/>
-              <w:right w:w="100" w:type="dxa"/>
-            </w:tcMar>
-          </w:tcPr>
-          <w:p>
-            <w:pPr>
-              <w:widowControl w:val="0"/>
-              <w:spacing w:line="240" w:lineRule="auto"/>
-              <w:jc w:val="right"/>
-            </w:pPr>
-          </w:p>
-        </w:tc>
-        <w:tc>
-          <w:tcPr>
-            <w:tcW w:w="450" w:type="dxa"/>
-            <w:tcMar>
-              <w:top w:w="100" w:type="dxa"/>
-              <w:left w:w="100" w:type="dxa"/>
-              <w:bottom w:w="100" w:type="dxa"/>
-              <w:right w:w="100" w:type="dxa"/>
-            </w:tcMar>
-          </w:tcPr>
-          <w:p>
-            <w:pPr>
-              <w:widowControl w:val="0"/>
-              <w:pBdr>
-                <w:top w:val="nil"/>
-                <w:left w:val="nil"/>
-                <w:bottom w:val="nil"/>
-                <w:right w:val="nil"/>
-                <w:between w:val="nil"/>
-              </w:pBdr>
-              <w:spacing w:line="240" w:lineRule="auto"/>
+              <w:rPr>
+                <w:rFonts w:ascii="Times New Roman" w:hAnsi="Times New Roman" w:cs="Times New Roman"/>
+              </w:rPr>
+            </w:pPr>
+            <w:r>
+              <w:rPr>
+                <w:rFonts w:ascii="Times New Roman" w:hAnsi="Times New Roman" w:cs="Times New Roman"/>
+              </w:rPr>
+              <w:t>{{ item.tax }}</w:t>
+            </w:r>
+          </w:p>
+        </w:tc>
+        <w:tc>
+          <w:tcPr>
+            <w:tcW w:w="1581" w:type="dxa"/>
+            <w:tcMar>
+              <w:top w:w="100" w:type="dxa"/>
+              <w:left w:w="100" w:type="dxa"/>
+              <w:bottom w:w="100" w:type="dxa"/>
+              <w:right w:w="100" w:type="dxa"/>
+            </w:tcMar>
+          </w:tcPr>
+          <w:p>
+            <w:pPr>
+              <w:widowControl w:val="0"/>
+              <w:spacing w:line="240" w:lineRule="auto"/>
+              <w:jc w:val="right"/>
+              <w:rPr>
+                <w:rFonts w:ascii="Times New Roman" w:hAnsi="Times New Roman" w:cs="Times New Roman"/>
+              </w:rPr>
+            </w:pPr>
+            <w:r>
+              <w:rPr>
+                <w:rFonts w:ascii="Times New Roman" w:eastAsia="Roboto Mono" w:hAnsi="Times New Roman" w:cs="Times New Roman"/>
+                <w:sz w:val="18"/>
+                <w:szCs w:val="18"/>
+              </w:rPr>
+              <w:t>{{ item.amount }}</w:t>
+            </w:r>
+          </w:p>
+        </w:tc>
+        <w:tc>
+          <w:tcPr>
+            <w:tcW w:w="459" w:type="dxa"/>
+            <w:gridSpan w:val="2"/>
+            <w:tcMar>
+              <w:top w:w="100" w:type="dxa"/>
+              <w:left w:w="100" w:type="dxa"/>
+              <w:bottom w:w="100" w:type="dxa"/>
+              <w:right w:w="100" w:type="dxa"/>
+            </w:tcMar>
+          </w:tcPr>
+          <w:p>
+            <w:pPr>
+              <w:widowControl w:val="0"/>
+              <w:pBdr>
+                <w:top w:val="nil"/>
+                <w:left w:val="nil"/>
+                <w:bottom w:val="nil"/>
+                <w:right w:val="nil"/>
+                <w:between w:val="nil"/>
+              </w:pBdr>
+              <w:spacing w:line="240" w:lineRule="auto"/>
+              <w:rPr>
+                <w:rFonts w:ascii="Times New Roman" w:hAnsi="Times New Roman" w:cs="Times New Roman"/>
+              </w:rPr>
             </w:pPr>
           </w:p>
         </w:tc>
@@ -1631,6 +1804,7 @@
               </w:pBdr>
               <w:spacing w:line="240" w:lineRule="auto"/>
               <w:rPr>
+                <w:rFonts w:ascii="Times New Roman" w:hAnsi="Times New Roman" w:cs="Times New Roman"/>
                 <w:sz w:val="18"/>
                 <w:szCs w:val="18"/>
               </w:rPr>
@@ -1659,6 +1833,7 @@
               </w:pBdr>
               <w:spacing w:line="240" w:lineRule="auto"/>
               <w:rPr>
+                <w:rFonts w:ascii="Times New Roman" w:hAnsi="Times New Roman" w:cs="Times New Roman"/>
                 <w:sz w:val="18"/>
                 <w:szCs w:val="18"/>
               </w:rPr>
@@ -1679,6 +1854,9 @@
             <w:pPr>
               <w:widowControl w:val="0"/>
               <w:spacing w:line="240" w:lineRule="auto"/>
+              <w:rPr>
+                <w:rFonts w:ascii="Times New Roman" w:hAnsi="Times New Roman" w:cs="Times New Roman"/>
+              </w:rPr>
             </w:pPr>
           </w:p>
         </w:tc>
@@ -1704,6 +1882,9 @@
               </w:pBdr>
               <w:spacing w:line="240" w:lineRule="auto"/>
               <w:jc w:val="right"/>
+              <w:rPr>
+                <w:rFonts w:ascii="Times New Roman" w:hAnsi="Times New Roman" w:cs="Times New Roman"/>
+              </w:rPr>
             </w:pPr>
           </w:p>
         </w:tc>
@@ -1722,6 +1903,9 @@
               <w:widowControl w:val="0"/>
               <w:spacing w:line="240" w:lineRule="auto"/>
               <w:jc w:val="right"/>
+              <w:rPr>
+                <w:rFonts w:ascii="Times New Roman" w:hAnsi="Times New Roman" w:cs="Times New Roman"/>
+              </w:rPr>
             </w:pPr>
           </w:p>
         </w:tc>
@@ -1740,49 +1924,65 @@
               <w:widowControl w:val="0"/>
               <w:spacing w:line="240" w:lineRule="auto"/>
               <w:jc w:val="right"/>
-            </w:pPr>
-          </w:p>
-        </w:tc>
-        <w:tc>
-          <w:tcPr>
-            <w:tcW w:w="1590" w:type="dxa"/>
-            <w:tcMar>
-              <w:top w:w="100" w:type="dxa"/>
-              <w:left w:w="100" w:type="dxa"/>
-              <w:bottom w:w="100" w:type="dxa"/>
-              <w:right w:w="100" w:type="dxa"/>
-            </w:tcMar>
-          </w:tcPr>
-          <w:p>
-            <w:pPr>
-              <w:widowControl w:val="0"/>
-              <w:spacing w:line="240" w:lineRule="auto"/>
-              <w:jc w:val="right"/>
-            </w:pPr>
-          </w:p>
-        </w:tc>
-        <w:tc>
-          <w:tcPr>
-            <w:tcW w:w="450" w:type="dxa"/>
-            <w:tcMar>
-              <w:top w:w="100" w:type="dxa"/>
-              <w:left w:w="100" w:type="dxa"/>
-              <w:bottom w:w="100" w:type="dxa"/>
-              <w:right w:w="100" w:type="dxa"/>
-            </w:tcMar>
-          </w:tcPr>
-          <w:p>
-            <w:pPr>
-              <w:widowControl w:val="0"/>
-              <w:pBdr>
-                <w:top w:val="nil"/>
-                <w:left w:val="nil"/>
-                <w:bottom w:val="nil"/>
-                <w:right w:val="nil"/>
-                <w:between w:val="nil"/>
-              </w:pBdr>
-              <w:spacing w:line="240" w:lineRule="auto"/>
-              <w:rPr>
+              <w:rPr>
+                <w:rFonts w:ascii="Times New Roman" w:hAnsi="Times New Roman" w:cs="Times New Roman"/>
+              </w:rPr>
+            </w:pPr>
+          </w:p>
+        </w:tc>
+        <w:tc>
+          <w:tcPr>
+            <w:tcW w:w="1581" w:type="dxa"/>
+            <w:tcMar>
+              <w:top w:w="100" w:type="dxa"/>
+              <w:left w:w="100" w:type="dxa"/>
+              <w:bottom w:w="100" w:type="dxa"/>
+              <w:right w:w="100" w:type="dxa"/>
+            </w:tcMar>
+          </w:tcPr>
+          <w:p>
+            <w:pPr>
+              <w:widowControl w:val="0"/>
+              <w:spacing w:line="240" w:lineRule="auto"/>
+              <w:jc w:val="right"/>
+              <w:rPr>
+                <w:rFonts w:ascii="Times New Roman" w:hAnsi="Times New Roman" w:cs="Times New Roman"/>
+              </w:rPr>
+            </w:pPr>
+            <w:r>
+              <w:rPr>
+                <w:rFonts w:ascii="Times New Roman" w:eastAsia="Roboto Mono" w:hAnsi="Times New Roman" w:cs="Times New Roman"/>
+                <w:sz w:val="18"/>
+                <w:szCs w:val="18"/>
+              </w:rPr>
+              <w:t>{%tr endfor %}</w:t>
+            </w:r>
+          </w:p>
+        </w:tc>
+        <w:tc>
+          <w:tcPr>
+            <w:tcW w:w="459" w:type="dxa"/>
+            <w:gridSpan w:val="2"/>
+            <w:tcMar>
+              <w:top w:w="100" w:type="dxa"/>
+              <w:left w:w="100" w:type="dxa"/>
+              <w:bottom w:w="100" w:type="dxa"/>
+              <w:right w:w="100" w:type="dxa"/>
+            </w:tcMar>
+          </w:tcPr>
+          <w:p>
+            <w:pPr>
+              <w:widowControl w:val="0"/>
+              <w:pBdr>
+                <w:top w:val="nil"/>
+                <w:left w:val="nil"/>
+                <w:bottom w:val="nil"/>
+                <w:right w:val="nil"/>
+                <w:between w:val="nil"/>
+              </w:pBdr>
+              <w:spacing w:line="240" w:lineRule="auto"/>
+              <w:rPr>
+                <w:rFonts w:ascii="Times New Roman" w:hAnsi="Times New Roman" w:cs="Times New Roman"/>
                 <w:sz w:val="18"/>
                 <w:szCs w:val="18"/>
               </w:rPr>
@@ -1816,6 +2016,7 @@
               </w:pBdr>
               <w:spacing w:line="240" w:lineRule="auto"/>
               <w:rPr>
+                <w:rFonts w:ascii="Times New Roman" w:hAnsi="Times New Roman" w:cs="Times New Roman"/>
                 <w:sz w:val="18"/>
                 <w:szCs w:val="18"/>
               </w:rPr>
@@ -1844,6 +2045,7 @@
               </w:pBdr>
               <w:spacing w:line="240" w:lineRule="auto"/>
               <w:rPr>
+                <w:rFonts w:ascii="Times New Roman" w:hAnsi="Times New Roman" w:cs="Times New Roman"/>
                 <w:sz w:val="18"/>
                 <w:szCs w:val="18"/>
               </w:rPr>
@@ -1865,6 +2067,7 @@
               <w:widowControl w:val="0"/>
               <w:spacing w:line="240" w:lineRule="auto"/>
               <w:rPr>
+                <w:rFonts w:ascii="Times New Roman" w:hAnsi="Times New Roman" w:cs="Times New Roman"/>
                 <w:sz w:val="18"/>
                 <w:szCs w:val="18"/>
               </w:rPr>
@@ -1894,6 +2097,7 @@
               <w:spacing w:line="240" w:lineRule="auto"/>
               <w:jc w:val="right"/>
               <w:rPr>
+                <w:rFonts w:ascii="Times New Roman" w:hAnsi="Times New Roman" w:cs="Times New Roman"/>
                 <w:sz w:val="18"/>
                 <w:szCs w:val="18"/>
               </w:rPr>
@@ -1916,6 +2120,7 @@
               <w:spacing w:line="240" w:lineRule="auto"/>
               <w:jc w:val="right"/>
               <w:rPr>
+                <w:rFonts w:ascii="Times New Roman" w:hAnsi="Times New Roman" w:cs="Times New Roman"/>
                 <w:sz w:val="18"/>
                 <w:szCs w:val="18"/>
               </w:rPr>
@@ -1938,56 +2143,60 @@
               <w:spacing w:line="240" w:lineRule="auto"/>
               <w:jc w:val="right"/>
               <w:rPr>
-                <w:sz w:val="18"/>
-                <w:szCs w:val="18"/>
-              </w:rPr>
-            </w:pPr>
-          </w:p>
-        </w:tc>
-        <w:tc>
-          <w:tcPr>
-            <w:tcW w:w="1590" w:type="dxa"/>
-            <w:tcMar>
-              <w:top w:w="100" w:type="dxa"/>
-              <w:left w:w="100" w:type="dxa"/>
-              <w:bottom w:w="100" w:type="dxa"/>
-              <w:right w:w="100" w:type="dxa"/>
-            </w:tcMar>
-          </w:tcPr>
-          <w:p>
-            <w:pPr>
-              <w:widowControl w:val="0"/>
-              <w:spacing w:line="240" w:lineRule="auto"/>
-              <w:jc w:val="right"/>
-              <w:rPr>
-                <w:sz w:val="18"/>
-                <w:szCs w:val="18"/>
-              </w:rPr>
-            </w:pPr>
-          </w:p>
-        </w:tc>
-        <w:tc>
-          <w:tcPr>
-            <w:tcW w:w="450" w:type="dxa"/>
-            <w:tcMar>
-              <w:top w:w="100" w:type="dxa"/>
-              <w:left w:w="100" w:type="dxa"/>
-              <w:bottom w:w="100" w:type="dxa"/>
-              <w:right w:w="100" w:type="dxa"/>
-            </w:tcMar>
-          </w:tcPr>
-          <w:p>
-            <w:pPr>
-              <w:widowControl w:val="0"/>
-              <w:pBdr>
-                <w:top w:val="nil"/>
-                <w:left w:val="nil"/>
-                <w:bottom w:val="nil"/>
-                <w:right w:val="nil"/>
-                <w:between w:val="nil"/>
-              </w:pBdr>
-              <w:spacing w:line="240" w:lineRule="auto"/>
-              <w:rPr>
+                <w:rFonts w:ascii="Times New Roman" w:hAnsi="Times New Roman" w:cs="Times New Roman"/>
+                <w:sz w:val="18"/>
+                <w:szCs w:val="18"/>
+              </w:rPr>
+            </w:pPr>
+          </w:p>
+        </w:tc>
+        <w:tc>
+          <w:tcPr>
+            <w:tcW w:w="1581" w:type="dxa"/>
+            <w:tcMar>
+              <w:top w:w="100" w:type="dxa"/>
+              <w:left w:w="100" w:type="dxa"/>
+              <w:bottom w:w="100" w:type="dxa"/>
+              <w:right w:w="100" w:type="dxa"/>
+            </w:tcMar>
+          </w:tcPr>
+          <w:p>
+            <w:pPr>
+              <w:widowControl w:val="0"/>
+              <w:spacing w:line="240" w:lineRule="auto"/>
+              <w:jc w:val="right"/>
+              <w:rPr>
+                <w:rFonts w:ascii="Times New Roman" w:hAnsi="Times New Roman" w:cs="Times New Roman"/>
+                <w:sz w:val="18"/>
+                <w:szCs w:val="18"/>
+              </w:rPr>
+            </w:pPr>
+          </w:p>
+        </w:tc>
+        <w:tc>
+          <w:tcPr>
+            <w:tcW w:w="459" w:type="dxa"/>
+            <w:gridSpan w:val="2"/>
+            <w:tcMar>
+              <w:top w:w="100" w:type="dxa"/>
+              <w:left w:w="100" w:type="dxa"/>
+              <w:bottom w:w="100" w:type="dxa"/>
+              <w:right w:w="100" w:type="dxa"/>
+            </w:tcMar>
+          </w:tcPr>
+          <w:p>
+            <w:pPr>
+              <w:widowControl w:val="0"/>
+              <w:pBdr>
+                <w:top w:val="nil"/>
+                <w:left w:val="nil"/>
+                <w:bottom w:val="nil"/>
+                <w:right w:val="nil"/>
+                <w:between w:val="nil"/>
+              </w:pBdr>
+              <w:spacing w:line="240" w:lineRule="auto"/>
+              <w:rPr>
+                <w:rFonts w:ascii="Times New Roman" w:hAnsi="Times New Roman" w:cs="Times New Roman"/>
                 <w:sz w:val="18"/>
                 <w:szCs w:val="18"/>
               </w:rPr>
@@ -2021,6 +2230,7 @@
               </w:pBdr>
               <w:spacing w:line="240" w:lineRule="auto"/>
               <w:rPr>
+                <w:rFonts w:ascii="Times New Roman" w:hAnsi="Times New Roman" w:cs="Times New Roman"/>
                 <w:sz w:val="18"/>
                 <w:szCs w:val="18"/>
               </w:rPr>
@@ -2049,6 +2259,7 @@
               </w:pBdr>
               <w:spacing w:line="240" w:lineRule="auto"/>
               <w:rPr>
+                <w:rFonts w:ascii="Times New Roman" w:hAnsi="Times New Roman" w:cs="Times New Roman"/>
                 <w:sz w:val="18"/>
                 <w:szCs w:val="18"/>
               </w:rPr>
@@ -2070,6 +2281,7 @@
               <w:widowControl w:val="0"/>
               <w:spacing w:line="240" w:lineRule="auto"/>
               <w:rPr>
+                <w:rFonts w:ascii="Times New Roman" w:hAnsi="Times New Roman" w:cs="Times New Roman"/>
                 <w:sz w:val="18"/>
                 <w:szCs w:val="18"/>
               </w:rPr>
@@ -2099,6 +2311,7 @@
               <w:spacing w:line="240" w:lineRule="auto"/>
               <w:jc w:val="right"/>
               <w:rPr>
+                <w:rFonts w:ascii="Times New Roman" w:hAnsi="Times New Roman" w:cs="Times New Roman"/>
                 <w:sz w:val="18"/>
                 <w:szCs w:val="18"/>
               </w:rPr>
@@ -2121,6 +2334,7 @@
               <w:spacing w:line="240" w:lineRule="auto"/>
               <w:jc w:val="right"/>
               <w:rPr>
+                <w:rFonts w:ascii="Times New Roman" w:hAnsi="Times New Roman" w:cs="Times New Roman"/>
                 <w:sz w:val="18"/>
                 <w:szCs w:val="18"/>
               </w:rPr>
@@ -2143,56 +2357,60 @@
               <w:spacing w:line="240" w:lineRule="auto"/>
               <w:jc w:val="right"/>
               <w:rPr>
-                <w:sz w:val="18"/>
-                <w:szCs w:val="18"/>
-              </w:rPr>
-            </w:pPr>
-          </w:p>
-        </w:tc>
-        <w:tc>
-          <w:tcPr>
-            <w:tcW w:w="1590" w:type="dxa"/>
-            <w:tcMar>
-              <w:top w:w="100" w:type="dxa"/>
-              <w:left w:w="100" w:type="dxa"/>
-              <w:bottom w:w="100" w:type="dxa"/>
-              <w:right w:w="100" w:type="dxa"/>
-            </w:tcMar>
-          </w:tcPr>
-          <w:p>
-            <w:pPr>
-              <w:widowControl w:val="0"/>
-              <w:spacing w:line="240" w:lineRule="auto"/>
-              <w:jc w:val="right"/>
-              <w:rPr>
-                <w:sz w:val="18"/>
-                <w:szCs w:val="18"/>
-              </w:rPr>
-            </w:pPr>
-          </w:p>
-        </w:tc>
-        <w:tc>
-          <w:tcPr>
-            <w:tcW w:w="450" w:type="dxa"/>
-            <w:tcMar>
-              <w:top w:w="100" w:type="dxa"/>
-              <w:left w:w="100" w:type="dxa"/>
-              <w:bottom w:w="100" w:type="dxa"/>
-              <w:right w:w="100" w:type="dxa"/>
-            </w:tcMar>
-          </w:tcPr>
-          <w:p>
-            <w:pPr>
-              <w:widowControl w:val="0"/>
-              <w:pBdr>
-                <w:top w:val="nil"/>
-                <w:left w:val="nil"/>
-                <w:bottom w:val="nil"/>
-                <w:right w:val="nil"/>
-                <w:between w:val="nil"/>
-              </w:pBdr>
-              <w:spacing w:line="240" w:lineRule="auto"/>
-              <w:rPr>
+                <w:rFonts w:ascii="Times New Roman" w:hAnsi="Times New Roman" w:cs="Times New Roman"/>
+                <w:sz w:val="18"/>
+                <w:szCs w:val="18"/>
+              </w:rPr>
+            </w:pPr>
+          </w:p>
+        </w:tc>
+        <w:tc>
+          <w:tcPr>
+            <w:tcW w:w="1581" w:type="dxa"/>
+            <w:tcMar>
+              <w:top w:w="100" w:type="dxa"/>
+              <w:left w:w="100" w:type="dxa"/>
+              <w:bottom w:w="100" w:type="dxa"/>
+              <w:right w:w="100" w:type="dxa"/>
+            </w:tcMar>
+          </w:tcPr>
+          <w:p>
+            <w:pPr>
+              <w:widowControl w:val="0"/>
+              <w:spacing w:line="240" w:lineRule="auto"/>
+              <w:jc w:val="right"/>
+              <w:rPr>
+                <w:rFonts w:ascii="Times New Roman" w:hAnsi="Times New Roman" w:cs="Times New Roman"/>
+                <w:sz w:val="18"/>
+                <w:szCs w:val="18"/>
+              </w:rPr>
+            </w:pPr>
+          </w:p>
+        </w:tc>
+        <w:tc>
+          <w:tcPr>
+            <w:tcW w:w="459" w:type="dxa"/>
+            <w:gridSpan w:val="2"/>
+            <w:tcMar>
+              <w:top w:w="100" w:type="dxa"/>
+              <w:left w:w="100" w:type="dxa"/>
+              <w:bottom w:w="100" w:type="dxa"/>
+              <w:right w:w="100" w:type="dxa"/>
+            </w:tcMar>
+          </w:tcPr>
+          <w:p>
+            <w:pPr>
+              <w:widowControl w:val="0"/>
+              <w:pBdr>
+                <w:top w:val="nil"/>
+                <w:left w:val="nil"/>
+                <w:bottom w:val="nil"/>
+                <w:right w:val="nil"/>
+                <w:between w:val="nil"/>
+              </w:pBdr>
+              <w:spacing w:line="240" w:lineRule="auto"/>
+              <w:rPr>
+                <w:rFonts w:ascii="Times New Roman" w:hAnsi="Times New Roman" w:cs="Times New Roman"/>
                 <w:sz w:val="18"/>
                 <w:szCs w:val="18"/>
               </w:rPr>
@@ -2226,6 +2444,7 @@
               </w:pBdr>
               <w:spacing w:line="240" w:lineRule="auto"/>
               <w:rPr>
+                <w:rFonts w:ascii="Times New Roman" w:hAnsi="Times New Roman" w:cs="Times New Roman"/>
                 <w:sz w:val="18"/>
                 <w:szCs w:val="18"/>
               </w:rPr>
@@ -2254,6 +2473,7 @@
               </w:pBdr>
               <w:spacing w:line="240" w:lineRule="auto"/>
               <w:rPr>
+                <w:rFonts w:ascii="Times New Roman" w:hAnsi="Times New Roman" w:cs="Times New Roman"/>
                 <w:sz w:val="18"/>
                 <w:szCs w:val="18"/>
               </w:rPr>
@@ -2275,6 +2495,7 @@
               <w:widowControl w:val="0"/>
               <w:spacing w:line="240" w:lineRule="auto"/>
               <w:rPr>
+                <w:rFonts w:ascii="Times New Roman" w:hAnsi="Times New Roman" w:cs="Times New Roman"/>
                 <w:sz w:val="18"/>
                 <w:szCs w:val="18"/>
               </w:rPr>
@@ -2304,6 +2525,7 @@
               <w:spacing w:line="240" w:lineRule="auto"/>
               <w:jc w:val="right"/>
               <w:rPr>
+                <w:rFonts w:ascii="Times New Roman" w:hAnsi="Times New Roman" w:cs="Times New Roman"/>
                 <w:sz w:val="18"/>
                 <w:szCs w:val="18"/>
               </w:rPr>
@@ -2326,6 +2548,7 @@
               <w:spacing w:line="240" w:lineRule="auto"/>
               <w:jc w:val="right"/>
               <w:rPr>
+                <w:rFonts w:ascii="Times New Roman" w:hAnsi="Times New Roman" w:cs="Times New Roman"/>
                 <w:sz w:val="18"/>
                 <w:szCs w:val="18"/>
               </w:rPr>
@@ -2348,56 +2571,60 @@
               <w:spacing w:line="240" w:lineRule="auto"/>
               <w:jc w:val="right"/>
               <w:rPr>
-                <w:sz w:val="18"/>
-                <w:szCs w:val="18"/>
-              </w:rPr>
-            </w:pPr>
-          </w:p>
-        </w:tc>
-        <w:tc>
-          <w:tcPr>
-            <w:tcW w:w="1590" w:type="dxa"/>
-            <w:tcMar>
-              <w:top w:w="100" w:type="dxa"/>
-              <w:left w:w="100" w:type="dxa"/>
-              <w:bottom w:w="100" w:type="dxa"/>
-              <w:right w:w="100" w:type="dxa"/>
-            </w:tcMar>
-          </w:tcPr>
-          <w:p>
-            <w:pPr>
-              <w:widowControl w:val="0"/>
-              <w:spacing w:line="240" w:lineRule="auto"/>
-              <w:jc w:val="right"/>
-              <w:rPr>
-                <w:sz w:val="18"/>
-                <w:szCs w:val="18"/>
-              </w:rPr>
-            </w:pPr>
-          </w:p>
-        </w:tc>
-        <w:tc>
-          <w:tcPr>
-            <w:tcW w:w="450" w:type="dxa"/>
-            <w:tcMar>
-              <w:top w:w="100" w:type="dxa"/>
-              <w:left w:w="100" w:type="dxa"/>
-              <w:bottom w:w="100" w:type="dxa"/>
-              <w:right w:w="100" w:type="dxa"/>
-            </w:tcMar>
-          </w:tcPr>
-          <w:p>
-            <w:pPr>
-              <w:widowControl w:val="0"/>
-              <w:pBdr>
-                <w:top w:val="nil"/>
-                <w:left w:val="nil"/>
-                <w:bottom w:val="nil"/>
-                <w:right w:val="nil"/>
-                <w:between w:val="nil"/>
-              </w:pBdr>
-              <w:spacing w:line="240" w:lineRule="auto"/>
-              <w:rPr>
+                <w:rFonts w:ascii="Times New Roman" w:hAnsi="Times New Roman" w:cs="Times New Roman"/>
+                <w:sz w:val="18"/>
+                <w:szCs w:val="18"/>
+              </w:rPr>
+            </w:pPr>
+          </w:p>
+        </w:tc>
+        <w:tc>
+          <w:tcPr>
+            <w:tcW w:w="1581" w:type="dxa"/>
+            <w:tcMar>
+              <w:top w:w="100" w:type="dxa"/>
+              <w:left w:w="100" w:type="dxa"/>
+              <w:bottom w:w="100" w:type="dxa"/>
+              <w:right w:w="100" w:type="dxa"/>
+            </w:tcMar>
+          </w:tcPr>
+          <w:p>
+            <w:pPr>
+              <w:widowControl w:val="0"/>
+              <w:spacing w:line="240" w:lineRule="auto"/>
+              <w:jc w:val="right"/>
+              <w:rPr>
+                <w:rFonts w:ascii="Times New Roman" w:hAnsi="Times New Roman" w:cs="Times New Roman"/>
+                <w:sz w:val="18"/>
+                <w:szCs w:val="18"/>
+              </w:rPr>
+            </w:pPr>
+          </w:p>
+        </w:tc>
+        <w:tc>
+          <w:tcPr>
+            <w:tcW w:w="459" w:type="dxa"/>
+            <w:gridSpan w:val="2"/>
+            <w:tcMar>
+              <w:top w:w="100" w:type="dxa"/>
+              <w:left w:w="100" w:type="dxa"/>
+              <w:bottom w:w="100" w:type="dxa"/>
+              <w:right w:w="100" w:type="dxa"/>
+            </w:tcMar>
+          </w:tcPr>
+          <w:p>
+            <w:pPr>
+              <w:widowControl w:val="0"/>
+              <w:pBdr>
+                <w:top w:val="nil"/>
+                <w:left w:val="nil"/>
+                <w:bottom w:val="nil"/>
+                <w:right w:val="nil"/>
+                <w:between w:val="nil"/>
+              </w:pBdr>
+              <w:spacing w:line="240" w:lineRule="auto"/>
+              <w:rPr>
+                <w:rFonts w:ascii="Times New Roman" w:hAnsi="Times New Roman" w:cs="Times New Roman"/>
                 <w:sz w:val="18"/>
                 <w:szCs w:val="18"/>
               </w:rPr>
@@ -2431,6 +2658,7 @@
               </w:pBdr>
               <w:spacing w:line="240" w:lineRule="auto"/>
               <w:rPr>
+                <w:rFonts w:ascii="Times New Roman" w:hAnsi="Times New Roman" w:cs="Times New Roman"/>
                 <w:sz w:val="18"/>
                 <w:szCs w:val="18"/>
               </w:rPr>
@@ -2459,6 +2687,7 @@
               </w:pBdr>
               <w:spacing w:line="240" w:lineRule="auto"/>
               <w:rPr>
+                <w:rFonts w:ascii="Times New Roman" w:hAnsi="Times New Roman" w:cs="Times New Roman"/>
                 <w:sz w:val="18"/>
                 <w:szCs w:val="18"/>
               </w:rPr>
@@ -2480,6 +2709,7 @@
               <w:widowControl w:val="0"/>
               <w:spacing w:line="240" w:lineRule="auto"/>
               <w:rPr>
+                <w:rFonts w:ascii="Times New Roman" w:hAnsi="Times New Roman" w:cs="Times New Roman"/>
                 <w:sz w:val="18"/>
                 <w:szCs w:val="18"/>
               </w:rPr>
@@ -2509,6 +2739,7 @@
               <w:spacing w:line="240" w:lineRule="auto"/>
               <w:jc w:val="right"/>
               <w:rPr>
+                <w:rFonts w:ascii="Times New Roman" w:hAnsi="Times New Roman" w:cs="Times New Roman"/>
                 <w:sz w:val="18"/>
                 <w:szCs w:val="18"/>
               </w:rPr>
@@ -2531,6 +2762,7 @@
               <w:spacing w:line="240" w:lineRule="auto"/>
               <w:jc w:val="right"/>
               <w:rPr>
+                <w:rFonts w:ascii="Times New Roman" w:hAnsi="Times New Roman" w:cs="Times New Roman"/>
                 <w:sz w:val="18"/>
                 <w:szCs w:val="18"/>
               </w:rPr>
@@ -2553,56 +2785,60 @@
               <w:spacing w:line="240" w:lineRule="auto"/>
               <w:jc w:val="right"/>
               <w:rPr>
-                <w:sz w:val="18"/>
-                <w:szCs w:val="18"/>
-              </w:rPr>
-            </w:pPr>
-          </w:p>
-        </w:tc>
-        <w:tc>
-          <w:tcPr>
-            <w:tcW w:w="1590" w:type="dxa"/>
-            <w:tcMar>
-              <w:top w:w="100" w:type="dxa"/>
-              <w:left w:w="100" w:type="dxa"/>
-              <w:bottom w:w="100" w:type="dxa"/>
-              <w:right w:w="100" w:type="dxa"/>
-            </w:tcMar>
-          </w:tcPr>
-          <w:p>
-            <w:pPr>
-              <w:widowControl w:val="0"/>
-              <w:spacing w:line="240" w:lineRule="auto"/>
-              <w:jc w:val="right"/>
-              <w:rPr>
-                <w:sz w:val="18"/>
-                <w:szCs w:val="18"/>
-              </w:rPr>
-            </w:pPr>
-          </w:p>
-        </w:tc>
-        <w:tc>
-          <w:tcPr>
-            <w:tcW w:w="450" w:type="dxa"/>
-            <w:tcMar>
-              <w:top w:w="100" w:type="dxa"/>
-              <w:left w:w="100" w:type="dxa"/>
-              <w:bottom w:w="100" w:type="dxa"/>
-              <w:right w:w="100" w:type="dxa"/>
-            </w:tcMar>
-          </w:tcPr>
-          <w:p>
-            <w:pPr>
-              <w:widowControl w:val="0"/>
-              <w:pBdr>
-                <w:top w:val="nil"/>
-                <w:left w:val="nil"/>
-                <w:bottom w:val="nil"/>
-                <w:right w:val="nil"/>
-                <w:between w:val="nil"/>
-              </w:pBdr>
-              <w:spacing w:line="240" w:lineRule="auto"/>
-              <w:rPr>
+                <w:rFonts w:ascii="Times New Roman" w:hAnsi="Times New Roman" w:cs="Times New Roman"/>
+                <w:sz w:val="18"/>
+                <w:szCs w:val="18"/>
+              </w:rPr>
+            </w:pPr>
+          </w:p>
+        </w:tc>
+        <w:tc>
+          <w:tcPr>
+            <w:tcW w:w="1581" w:type="dxa"/>
+            <w:tcMar>
+              <w:top w:w="100" w:type="dxa"/>
+              <w:left w:w="100" w:type="dxa"/>
+              <w:bottom w:w="100" w:type="dxa"/>
+              <w:right w:w="100" w:type="dxa"/>
+            </w:tcMar>
+          </w:tcPr>
+          <w:p>
+            <w:pPr>
+              <w:widowControl w:val="0"/>
+              <w:spacing w:line="240" w:lineRule="auto"/>
+              <w:jc w:val="right"/>
+              <w:rPr>
+                <w:rFonts w:ascii="Times New Roman" w:hAnsi="Times New Roman" w:cs="Times New Roman"/>
+                <w:sz w:val="18"/>
+                <w:szCs w:val="18"/>
+              </w:rPr>
+            </w:pPr>
+          </w:p>
+        </w:tc>
+        <w:tc>
+          <w:tcPr>
+            <w:tcW w:w="459" w:type="dxa"/>
+            <w:gridSpan w:val="2"/>
+            <w:tcMar>
+              <w:top w:w="100" w:type="dxa"/>
+              <w:left w:w="100" w:type="dxa"/>
+              <w:bottom w:w="100" w:type="dxa"/>
+              <w:right w:w="100" w:type="dxa"/>
+            </w:tcMar>
+          </w:tcPr>
+          <w:p>
+            <w:pPr>
+              <w:widowControl w:val="0"/>
+              <w:pBdr>
+                <w:top w:val="nil"/>
+                <w:left w:val="nil"/>
+                <w:bottom w:val="nil"/>
+                <w:right w:val="nil"/>
+                <w:between w:val="nil"/>
+              </w:pBdr>
+              <w:spacing w:line="240" w:lineRule="auto"/>
+              <w:rPr>
+                <w:rFonts w:ascii="Times New Roman" w:hAnsi="Times New Roman" w:cs="Times New Roman"/>
                 <w:sz w:val="18"/>
                 <w:szCs w:val="18"/>
               </w:rPr>
@@ -2637,6 +2873,9 @@
                 <w:between w:val="nil"/>
               </w:pBdr>
               <w:spacing w:line="240" w:lineRule="auto"/>
+              <w:rPr>
+                <w:rFonts w:ascii="Times New Roman" w:hAnsi="Times New Roman" w:cs="Times New Roman"/>
+              </w:rPr>
             </w:pPr>
           </w:p>
         </w:tc>
@@ -2658,6 +2897,7 @@
               <w:widowControl w:val="0"/>
               <w:spacing w:line="392" w:lineRule="auto"/>
               <w:rPr>
+                <w:rFonts w:ascii="Times New Roman" w:hAnsi="Times New Roman" w:cs="Times New Roman"/>
                 <w:b/>
                 <w:bCs/>
                 <w:sz w:val="16"/>
@@ -2668,7 +2908,7 @@
         </w:tc>
         <w:tc>
           <w:tcPr>
-            <w:tcW w:w="5730" w:type="dxa"/>
+            <w:tcW w:w="5721" w:type="dxa"/>
             <w:gridSpan w:val="4"/>
             <w:shd w:val="clear" w:color="auto" w:fill="1F65A6"/>
             <w:tcMar>
@@ -2685,6 +2925,7 @@
               <w:spacing w:line="392" w:lineRule="auto"/>
               <w:jc w:val="right"/>
               <w:rPr>
+                <w:rFonts w:ascii="Times New Roman" w:hAnsi="Times New Roman" w:cs="Times New Roman"/>
                 <w:b/>
                 <w:bCs/>
                 <w:color w:val="FFFFFF"/>
@@ -2696,7 +2937,8 @@
         </w:tc>
         <w:tc>
           <w:tcPr>
-            <w:tcW w:w="450" w:type="dxa"/>
+            <w:tcW w:w="459" w:type="dxa"/>
+            <w:gridSpan w:val="2"/>
             <w:shd w:val="clear" w:color="auto" w:fill="1F65A6"/>
             <w:tcMar>
               <w:top w:w="100" w:type="dxa"/>
@@ -2717,6 +2959,9 @@
                 <w:between w:val="nil"/>
               </w:pBdr>
               <w:spacing w:line="240" w:lineRule="auto"/>
+              <w:rPr>
+                <w:rFonts w:ascii="Times New Roman" w:hAnsi="Times New Roman" w:cs="Times New Roman"/>
+              </w:rPr>
             </w:pPr>
           </w:p>
         </w:tc>
@@ -2748,6 +2993,9 @@
                 <w:between w:val="nil"/>
               </w:pBdr>
               <w:spacing w:line="240" w:lineRule="auto"/>
+              <w:rPr>
+                <w:rFonts w:ascii="Times New Roman" w:hAnsi="Times New Roman" w:cs="Times New Roman"/>
+              </w:rPr>
             </w:pPr>
           </w:p>
         </w:tc>
@@ -2768,9 +3016,13 @@
             <w:pPr>
               <w:widowControl w:val="0"/>
               <w:spacing w:line="392" w:lineRule="auto"/>
+              <w:rPr>
+                <w:rFonts w:ascii="Times New Roman" w:hAnsi="Times New Roman" w:cs="Times New Roman"/>
+              </w:rPr>
             </w:pPr>
             <w:r>
               <w:rPr>
+                <w:rFonts w:ascii="Times New Roman" w:hAnsi="Times New Roman" w:cs="Times New Roman"/>
                 <w:b/>
                 <w:bCs/>
                 <w:sz w:val="16"/>
@@ -2782,7 +3034,7 @@
         </w:tc>
         <w:tc>
           <w:tcPr>
-            <w:tcW w:w="5730" w:type="dxa"/>
+            <w:tcW w:w="5721" w:type="dxa"/>
             <w:gridSpan w:val="4"/>
             <w:shd w:val="clear" w:color="auto" w:fill="1F65A6"/>
             <w:tcMar>
@@ -2799,11 +3051,13 @@
               <w:spacing w:line="392" w:lineRule="auto"/>
               <w:jc w:val="right"/>
               <w:rPr>
+                <w:rFonts w:ascii="Times New Roman" w:hAnsi="Times New Roman" w:cs="Times New Roman"/>
                 <w:color w:val="FFFFFF"/>
               </w:rPr>
             </w:pPr>
             <w:r>
               <w:rPr>
+                <w:rFonts w:ascii="Times New Roman" w:hAnsi="Times New Roman" w:cs="Times New Roman"/>
                 <w:b/>
                 <w:bCs/>
                 <w:color w:val="FFFFFF"/>
@@ -2816,7 +3070,8 @@
         </w:tc>
         <w:tc>
           <w:tcPr>
-            <w:tcW w:w="450" w:type="dxa"/>
+            <w:tcW w:w="459" w:type="dxa"/>
+            <w:gridSpan w:val="2"/>
             <w:shd w:val="clear" w:color="auto" w:fill="1F65A6"/>
             <w:tcMar>
               <w:top w:w="100" w:type="dxa"/>
@@ -2837,6 +3092,9 @@
                 <w:between w:val="nil"/>
               </w:pBdr>
               <w:spacing w:line="240" w:lineRule="auto"/>
+              <w:rPr>
+                <w:rFonts w:ascii="Times New Roman" w:hAnsi="Times New Roman" w:cs="Times New Roman"/>
+              </w:rPr>
             </w:pPr>
           </w:p>
         </w:tc>
@@ -2867,6 +3125,9 @@
                 <w:between w:val="nil"/>
               </w:pBdr>
               <w:spacing w:line="240" w:lineRule="auto"/>
+              <w:rPr>
+                <w:rFonts w:ascii="Times New Roman" w:hAnsi="Times New Roman" w:cs="Times New Roman"/>
+              </w:rPr>
             </w:pPr>
           </w:p>
         </w:tc>
@@ -2887,11 +3148,15 @@
               <w:widowControl w:val="0"/>
               <w:spacing w:line="392" w:lineRule="auto"/>
               <w:rPr>
+                <w:rFonts w:ascii="Times New Roman" w:hAnsi="Times New Roman" w:cs="Times New Roman"/>
                 <w:sz w:val="18"/>
                 <w:szCs w:val="18"/>
               </w:rPr>
             </w:pPr>
             <w:r>
+              <w:rPr>
+                <w:rFonts w:ascii="Times New Roman" w:hAnsi="Times New Roman" w:cs="Times New Roman"/>
+              </w:rPr>
               <w:t>{{ notes_preamble }} Here is the link to the timesheet for the associated month of {{ month_human }} - {{ timesheet_url }}</w:t>
             </w:r>
           </w:p>
@@ -2900,6 +3165,7 @@
               <w:widowControl w:val="0"/>
               <w:spacing w:line="392" w:lineRule="auto"/>
               <w:rPr>
+                <w:rFonts w:ascii="Times New Roman" w:hAnsi="Times New Roman" w:cs="Times New Roman"/>
                 <w:sz w:val="18"/>
                 <w:szCs w:val="18"/>
               </w:rPr>
@@ -2910,6 +3176,7 @@
               <w:widowControl w:val="0"/>
               <w:spacing w:line="392" w:lineRule="auto"/>
               <w:rPr>
+                <w:rFonts w:ascii="Times New Roman" w:hAnsi="Times New Roman" w:cs="Times New Roman"/>
                 <w:sz w:val="18"/>
                 <w:szCs w:val="18"/>
               </w:rPr>
@@ -2920,15 +3187,16 @@
               <w:widowControl w:val="0"/>
               <w:spacing w:line="392" w:lineRule="auto"/>
               <w:rPr>
-                <w:sz w:val="18"/>
-                <w:szCs w:val="18"/>
-              </w:rPr>
-            </w:pPr>
-          </w:p>
-        </w:tc>
-        <w:tc>
-          <w:tcPr>
-            <w:tcW w:w="5730" w:type="dxa"/>
+                <w:rFonts w:ascii="Times New Roman" w:hAnsi="Times New Roman" w:cs="Times New Roman"/>
+                <w:sz w:val="18"/>
+                <w:szCs w:val="18"/>
+              </w:rPr>
+            </w:pPr>
+          </w:p>
+        </w:tc>
+        <w:tc>
+          <w:tcPr>
+            <w:tcW w:w="5721" w:type="dxa"/>
             <w:gridSpan w:val="4"/>
             <w:shd w:val="clear" w:color="auto" w:fill="1F65A6"/>
             <w:tcMar>
@@ -2944,6 +3212,7 @@
               <w:spacing w:line="240" w:lineRule="auto"/>
               <w:jc w:val="right"/>
               <w:rPr>
+                <w:rFonts w:ascii="Times New Roman" w:hAnsi="Times New Roman" w:cs="Times New Roman"/>
                 <w:b/>
                 <w:bCs/>
                 <w:color w:val="FFFFFF" w:themeColor="background1"/>
@@ -2953,6 +3222,7 @@
             </w:pPr>
             <w:r>
               <w:rPr>
+                <w:rFonts w:ascii="Times New Roman" w:hAnsi="Times New Roman" w:cs="Times New Roman"/>
                 <w:b/>
                 <w:bCs/>
                 <w:color w:val="FFFFFF" w:themeColor="background1"/>
@@ -2968,6 +3238,7 @@
               <w:spacing w:line="240" w:lineRule="auto"/>
               <w:jc w:val="right"/>
               <w:rPr>
+                <w:rFonts w:ascii="Times New Roman" w:hAnsi="Times New Roman" w:cs="Times New Roman"/>
                 <w:b/>
                 <w:bCs/>
                 <w:color w:val="FFFFFF" w:themeColor="background1"/>
@@ -2977,6 +3248,7 @@
             </w:pPr>
             <w:r>
               <w:rPr>
+                <w:rFonts w:ascii="Times New Roman" w:hAnsi="Times New Roman" w:cs="Times New Roman"/>
                 <w:color w:val="FFFFFF" w:themeColor="background1"/>
               </w:rPr>
               <w:t>{{ payment_suffix }}</w:t>
@@ -2985,7 +3257,8 @@
         </w:tc>
         <w:tc>
           <w:tcPr>
-            <w:tcW w:w="450" w:type="dxa"/>
+            <w:tcW w:w="459" w:type="dxa"/>
+            <w:gridSpan w:val="2"/>
             <w:shd w:val="clear" w:color="auto" w:fill="1F65A6"/>
             <w:tcMar>
               <w:top w:w="100" w:type="dxa"/>
@@ -3005,12 +3278,21 @@
                 <w:between w:val="nil"/>
               </w:pBdr>
               <w:spacing w:line="240" w:lineRule="auto"/>
+              <w:rPr>
+                <w:rFonts w:ascii="Times New Roman" w:hAnsi="Times New Roman" w:cs="Times New Roman"/>
+              </w:rPr>
             </w:pPr>
           </w:p>
         </w:tc>
       </w:tr>
     </w:tbl>
-    <w:p/>
+    <w:p>
+      <w:pPr>
+        <w:rPr>
+          <w:rFonts w:ascii="Times New Roman" w:hAnsi="Times New Roman" w:cs="Times New Roman"/>
+        </w:rPr>
+      </w:pPr>
+    </w:p>
     <w:sectPr>
       <w:pgSz w:w="12240" w:h="15840"/>
       <w:pgMar w:top="0" w:right="0" w:bottom="0" w:left="0" w:header="720" w:footer="0" w:gutter="0"/>

</xml_diff>